<commit_message>
Disclose the withdrawn earlier JSS submission in the cover letter
Co-Authored-By: Aime <aime@bytedance.com>
Change-Id: I6cf6ae35509f57d4037bc65d54161a83d2836e5f
</commit_message>
<xml_diff>
--- a/submission/cover_letter.docx
+++ b/submission/cover_letter.docx
@@ -60,6 +60,11 @@
     <w:p>
       <w:r>
         <w:t>Disclosure of related work by the same authors. A companion manuscript, *“Large per-window oracle headroom that three selector families did not convert: a feedback-delay audit of plug-in selection for time series forecasting,”* is under review elsewhere. The two manuscripts share the forecasting grid, the trained checkpoints, the dataset preparation, the same loader-order defect and the same corrected cross-arm variance term; they address disjoint questions and report disjoint results. The present manuscript contributes the control degeneracy proposition, the two order diagnostics and their measured blind spots, the observed-permutation audit, the provenance contract, the dependence-aware re-analysis and the repair-cost measurement. The companion contributes selector training, the feedback-delay model, oracle headroom and gating policy. Neither manuscript’s claims depend on the other’s acceptance, and the shared material is described identically in both. We cite it in the present manuscript and state the relationship in a dedicated declaration so that the overlap can be assessed directly. We are happy to supply the companion manuscript to the editors on request.</w:t>
+      </w:r>
+    </w:p>
+    <w:p>
+      <w:r>
+        <w:t>Relationship to our earlier JSS submission. An earlier version of this work was submitted to JSS as JSSOFTWARE-D-26-02395, “Silent order corruption in per-sample evaluation artefacts: why the standard negative control cannot detect it, and two tests that can.” On 18 September 2026 we asked the editorial office to withdraw it, because reviewing that version would have been a poor use of referee time: it framed the two diagnostics as detectors of the fault, whereas the evidence in this version shows that the write-side provenance contract is the primary defence and that both diagnostics have blind spots we can now measure and enumerate. The present submission is that substantially revised manuscript, with a new title, a rewritten abstract, the dependence-aware re-analysis, the corrected cross-arm variance term and the measured contract coverage. It is intended to replace JSSOFTWARE-D-26-02395 rather than to accompany it; if the withdrawal has not yet been processed when this reaches you, please treat this submission as its replacement.</w:t>
       </w:r>
     </w:p>
     <w:p>

</xml_diff>